<commit_message>
finished phase 3(with old results)
</commit_message>
<xml_diff>
--- a/report.docx
+++ b/report.docx
@@ -14,9 +14,11 @@
         </w:rPr>
         <w:t xml:space="preserve">Έπειτα από ερώτηση στο </w:t>
       </w:r>
+      <w:proofErr w:type="spellStart"/>
       <w:r>
         <w:t>eclass</w:t>
       </w:r>
+      <w:proofErr w:type="spellEnd"/>
       <w:r>
         <w:rPr>
           <w:lang w:val="el-GR"/>
@@ -36,7 +38,7 @@
         <w:rPr>
           <w:lang w:val="el-GR"/>
         </w:rPr>
-        <w:t>2</w:t>
+        <w:t>3</w:t>
       </w:r>
       <w:r>
         <w:rPr>
@@ -51,7 +53,7 @@
         <w:rPr>
           <w:lang w:val="el-GR"/>
         </w:rPr>
-        <w:t>2</w:t>
+        <w:t>3</w:t>
       </w:r>
       <w:r>
         <w:rPr>
@@ -82,6 +84,20 @@
           <w:lang w:val="el-GR"/>
         </w:rPr>
         <w:t>’ Μέρους.</w:t>
+      </w:r>
+    </w:p>
+    <w:p/>
+    <w:p>
+      <w:pPr>
+        <w:rPr>
+          <w:lang w:val="el-GR"/>
+        </w:rPr>
+      </w:pPr>
+      <w:r>
+        <w:rPr>
+          <w:lang w:val="el-GR"/>
+        </w:rPr>
+        <w:t>Έχω επισυνάψει και τα προηγούμενα μέρη, σε περίπτωση που χρειαστούν να τρέξουν όλα μαζί.</w:t>
       </w:r>
     </w:p>
     <w:sectPr>

</xml_diff>